<commit_message>
Synchronize portfolio and resume content
</commit_message>
<xml_diff>
--- a/kkb_08052026.docx
+++ b/kkb_08052026.docx
@@ -87,7 +87,7 @@
             <w:sz w:val="18"/>
             <w:szCs w:val="18"/>
           </w:rPr>
-          <w:t>Github</w:t>
+          <w:t>GitHub</w:t>
         </w:r>
       </w:hyperlink>
       <w:r>
@@ -225,29 +225,7 @@
           <w:szCs w:val="20"/>
           <w:u w:val="none"/>
         </w:rPr>
-        <w:t xml:space="preserve">Sole architect and lead developer of NASA Earthdata Pub Overview and Forms applications used by all </w:t>
-      </w:r>
-      <w:r>
-        <w:rPr>
-          <w:rFonts w:cs="Arial" w:ascii="Arial" w:hAnsi="Arial"/>
-          <w:b/>
-          <w:color w:val="222222"/>
-          <w:sz w:val="20"/>
-          <w:szCs w:val="20"/>
-          <w:u w:val="none"/>
-        </w:rPr>
-        <w:t xml:space="preserve">12 NASA </w:t>
-      </w:r>
-      <w:r>
-        <w:rPr>
-          <w:rFonts w:cs="Arial" w:ascii="Arial" w:hAnsi="Arial"/>
-          <w:b/>
-          <w:color w:val="222222"/>
-          <w:sz w:val="20"/>
-          <w:szCs w:val="20"/>
-          <w:u w:val="none"/>
-        </w:rPr>
-        <w:t>DAACs for all Data Producers. Official NASA "Inventor" of Earthdata Pub (NASA Case No. GSC-18, 612-1).</w:t>
+        <w:t>Sole architect and lead developer of NASA Earthdata Pub Overview and Forms applications used by all 12 NASA DAACs and all Data Producers. Official NASA "Inventor" of Earthdata Pub (NASA Case No. GSC-18, 612-1).</w:t>
         <w:br/>
       </w:r>
       <w:r>
@@ -836,23 +814,7 @@
           <w:sz w:val="20"/>
           <w:szCs w:val="20"/>
         </w:rPr>
-        <w:t xml:space="preserve"> </w:t>
-      </w:r>
-      <w:r>
-        <w:rPr>
-          <w:rFonts w:cs="Arial"/>
-          <w:sz w:val="20"/>
-          <w:szCs w:val="20"/>
-        </w:rPr>
-        <w:t xml:space="preserve">Cline, </w:t>
-      </w:r>
-      <w:r>
-        <w:rPr>
-          <w:rFonts w:cs="Arial"/>
-          <w:sz w:val="20"/>
-          <w:szCs w:val="20"/>
-        </w:rPr>
-        <w:t>DUO AI, GitHub Copilot</w:t>
+        <w:t xml:space="preserve"> Cline, DUO AI, GitHub Copilot</w:t>
         <w:br/>
       </w:r>
       <w:r>
@@ -1312,13 +1274,13 @@
           <w:rFonts w:cs="Arial" w:ascii="Arial" w:hAnsi="Arial"/>
           <w:b/>
         </w:rPr>
-        <w:t xml:space="preserve">ORNL DAAC </w:t>
-      </w:r>
-      <w:r>
-        <w:rPr>
-          <w:rFonts w:cs="Arial" w:ascii="Arial" w:hAnsi="Arial"/>
-        </w:rPr>
-        <w:t xml:space="preserve">– Oak Ridge, TN         </w:t>
+        <w:t xml:space="preserve">NASA / ORNL DAAC </w:t>
+      </w:r>
+      <w:r>
+        <w:rPr>
+          <w:rFonts w:cs="Arial" w:ascii="Arial" w:hAnsi="Arial"/>
+        </w:rPr>
+        <w:t xml:space="preserve">– Oak Ridge, TN  </w:t>
         <w:tab/>
         <w:t xml:space="preserve">        </w:t>
         <w:tab/>
@@ -1335,14 +1297,7 @@
           <w:rFonts w:cs="Arial" w:ascii="Arial" w:hAnsi="Arial"/>
           <w:b/>
         </w:rPr>
-        <w:t xml:space="preserve">04/18 – </w:t>
-      </w:r>
-      <w:r>
-        <w:rPr>
-          <w:rFonts w:cs="Arial" w:ascii="Arial" w:hAnsi="Arial"/>
-          <w:b/>
-        </w:rPr>
-        <w:t>Present</w:t>
+        <w:t>04/18 – Present</w:t>
       </w:r>
     </w:p>
     <w:p>
@@ -1377,7 +1332,7 @@
         <w:rPr>
           <w:rFonts w:cs="Arial" w:ascii="Arial" w:hAnsi="Arial"/>
         </w:rPr>
-        <w:t>Developing in: Python, JavaScript (above frameworks and DevOps), SQLAlchemy, GraphQL, AWS Cloud, Perl, HTML, CSS, SQL, Drupal, DBVisualizer, VSCode</w:t>
+        <w:t>Developed in: Python, JavaScript (above frameworks and DevOps), SQLAlchemy, GraphQL, AWS Cloud, Perl, HTML, CSS, SQL, Drupal, DBVisualizer, VS Code</w:t>
       </w:r>
     </w:p>
     <w:p>
@@ -1398,14 +1353,7 @@
           <w:rFonts w:cs="Arial" w:ascii="Arial" w:hAnsi="Arial"/>
           <w:color w:val="222222"/>
         </w:rPr>
-        <w:t xml:space="preserve">Repurposed NASA's Cumulus Dashboard </w:t>
-      </w:r>
-      <w:r>
-        <w:rPr>
-          <w:rFonts w:cs="Arial" w:ascii="Arial" w:hAnsi="Arial"/>
-          <w:color w:val="222222"/>
-        </w:rPr>
-        <w:t xml:space="preserve">into the </w:t>
+        <w:t xml:space="preserve">Repurposed NASA's Cumulus Dashboard into the </w:t>
       </w:r>
       <w:hyperlink r:id="rId6">
         <w:r>
@@ -1422,14 +1370,7 @@
           <w:rFonts w:cs="Arial" w:ascii="Arial" w:hAnsi="Arial"/>
           <w:color w:val="222222"/>
         </w:rPr>
-        <w:t xml:space="preserve"> </w:t>
-      </w:r>
-      <w:r>
-        <w:rPr>
-          <w:rFonts w:cs="Arial" w:ascii="Arial" w:hAnsi="Arial"/>
-          <w:color w:val="222222"/>
-        </w:rPr>
-        <w:t xml:space="preserve">powering my </w:t>
+        <w:t xml:space="preserve"> powering my </w:t>
       </w:r>
       <w:hyperlink r:id="rId7">
         <w:r>
@@ -1463,14 +1404,7 @@
           <w:rFonts w:cs="Arial" w:ascii="Arial" w:hAnsi="Arial"/>
           <w:color w:val="222222"/>
         </w:rPr>
-        <w:t xml:space="preserve"> applications (Vue, React) </w:t>
-      </w:r>
-      <w:r>
-        <w:rPr>
-          <w:rFonts w:cs="Arial" w:ascii="Arial" w:hAnsi="Arial"/>
-          <w:color w:val="222222"/>
-        </w:rPr>
-        <w:t>serving all 12 NASA DAACs and hundreds of data producers</w:t>
+        <w:t xml:space="preserve"> applications (Vue, React) serving all 12 NASA DAACs and all data producers</w:t>
       </w:r>
     </w:p>
     <w:p>
@@ -1515,21 +1449,7 @@
           <w:rFonts w:cs="Arial" w:ascii="Arial" w:hAnsi="Arial"/>
           <w:color w:val="222222"/>
         </w:rPr>
-        <w:t xml:space="preserve">Assisted in refactoring and expansion of River Function Indicator Questionnaire (RFIQ) to </w:t>
-      </w:r>
-      <w:r>
-        <w:rPr>
-          <w:rFonts w:cs="Arial" w:ascii="Arial" w:hAnsi="Arial"/>
-          <w:color w:val="222222"/>
-        </w:rPr>
-        <w:t xml:space="preserve">a generalized </w:t>
-      </w:r>
-      <w:r>
-        <w:rPr>
-          <w:rFonts w:cs="Arial" w:ascii="Arial" w:hAnsi="Arial"/>
-          <w:color w:val="222222"/>
-        </w:rPr>
-        <w:t xml:space="preserve"> </w:t>
+        <w:t xml:space="preserve">Assisted in refactoring and expanding River Function Indicator Questionnaire (RFIQ) to a generalized  </w:t>
       </w:r>
       <w:hyperlink r:id="rId9">
         <w:r>
@@ -1987,7 +1907,7 @@
         <w:rPr>
           <w:rFonts w:cs="Arial" w:ascii="Arial" w:hAnsi="Arial"/>
         </w:rPr>
-        <w:t>Developed in: VB.NET/ASP.NET, XML, C#, TSQL, System7, SQL, Visual Studio 2015</w:t>
+        <w:t>Developed in: VB.NET / ASP.NET, XML, C#, TSQL, System7, SQL, Visual Studio 2015</w:t>
       </w:r>
     </w:p>
     <w:p>
@@ -2357,7 +2277,7 @@
         <w:rPr>
           <w:rFonts w:cs="Arial" w:ascii="Arial" w:hAnsi="Arial"/>
         </w:rPr>
-        <w:t>Developed in: Javascript, HTML, CSS, PHP, Python, Perl, Linux, MySQL, MSSQL, c-tree</w:t>
+        <w:t>Developed in: JavaScript, HTML, CSS, PHP, Python, Perl, Linux, MySQL, MSSQL, c-tree</w:t>
       </w:r>
     </w:p>
     <w:p>
@@ -2565,8 +2485,25 @@
           <w:sz w:val="20"/>
           <w:szCs w:val="20"/>
         </w:rPr>
-        <w:t xml:space="preserve"> – NN/g Norman Group</w:t>
-        <w:tab/>
+        <w:t xml:space="preserve"> – NN/g </w:t>
+      </w:r>
+      <w:r>
+        <w:rPr>
+          <w:rFonts w:cs="Arial" w:ascii="Arial" w:hAnsi="Arial"/>
+          <w:b w:val="false"/>
+          <w:bCs w:val="false"/>
+          <w:sz w:val="20"/>
+          <w:szCs w:val="20"/>
+          <w:u w:val="none"/>
+        </w:rPr>
+        <w:t>Nielsen Norman Group</w:t>
+      </w:r>
+      <w:r>
+        <w:rPr>
+          <w:rFonts w:cs="Arial" w:ascii="Arial" w:hAnsi="Arial"/>
+          <w:sz w:val="20"/>
+          <w:szCs w:val="20"/>
+        </w:rPr>
         <w:tab/>
         <w:tab/>
         <w:tab/>

</xml_diff>

<commit_message>
Polish master resume and portfolio
</commit_message>
<xml_diff>
--- a/kkb_08052026.docx
+++ b/kkb_08052026.docx
@@ -510,37 +510,14 @@
     <w:p>
       <w:pPr>
         <w:pStyle w:val="Normal"/>
-        <w:rPr/>
-      </w:pPr>
-      <w:r>
-        <w:rPr>
-          <w:rFonts w:cs="Arial" w:ascii="Arial" w:hAnsi="Arial"/>
-          <w:b/>
-          <w:color w:val="222222"/>
-        </w:rPr>
-        <w:t xml:space="preserve">Designed and implemented administrative software system to replace data processing department          </w:t>
-      </w:r>
-      <w:r>
-        <w:rPr>
-          <w:rFonts w:cs="Arial" w:ascii="Arial" w:hAnsi="Arial"/>
-          <w:b/>
-          <w:bCs/>
-          <w:color w:val="222222"/>
-        </w:rPr>
-        <w:t>02/2018</w:t>
-      </w:r>
-    </w:p>
-    <w:p>
-      <w:pPr>
-        <w:pStyle w:val="Normal"/>
-        <w:jc w:val="center"/>
+        <w:jc w:val="left"/>
         <w:rPr>
           <w:rFonts w:ascii="Arial" w:hAnsi="Arial" w:cs="Arial"/>
           <w:b/>
           <w:b/>
           <w:sz w:val="20"/>
           <w:szCs w:val="20"/>
-          <w:u w:val="single"/>
+          <w:u w:val="none"/>
         </w:rPr>
       </w:pPr>
       <w:r>
@@ -549,52 +526,9 @@
           <w:b/>
           <w:sz w:val="20"/>
           <w:szCs w:val="20"/>
-          <w:u w:val="single"/>
-        </w:rPr>
-      </w:r>
-    </w:p>
-    <w:p>
-      <w:pPr>
-        <w:pStyle w:val="Normal"/>
-        <w:rPr/>
-      </w:pPr>
-      <w:r>
-        <w:rPr>
-          <w:rFonts w:cs="Arial" w:ascii="Arial" w:hAnsi="Arial"/>
-          <w:b/>
-          <w:sz w:val="20"/>
-          <w:szCs w:val="20"/>
           <w:u w:val="none"/>
         </w:rPr>
-        <w:t xml:space="preserve">UI / UX Certified in User Experience – </w:t>
-      </w:r>
-      <w:r>
-        <w:rPr>
-          <w:rFonts w:cs="Arial" w:ascii="Arial" w:hAnsi="Arial"/>
-          <w:b w:val="false"/>
-          <w:bCs w:val="false"/>
-          <w:sz w:val="20"/>
-          <w:szCs w:val="20"/>
-          <w:u w:val="none"/>
-        </w:rPr>
-        <w:t>NN/g Nielsen Norman Group</w:t>
-        <w:tab/>
-        <w:tab/>
-        <w:tab/>
-        <w:tab/>
-        <w:tab/>
-        <w:t xml:space="preserve">          </w:t>
-      </w:r>
-      <w:r>
-        <w:rPr>
-          <w:rFonts w:cs="Arial" w:ascii="Arial" w:hAnsi="Arial"/>
-          <w:b/>
-          <w:bCs/>
-          <w:sz w:val="20"/>
-          <w:szCs w:val="20"/>
-          <w:u w:val="none"/>
-        </w:rPr>
-        <w:t>12/2020</w:t>
+        <w:t>Automated publishing workflows from hours of manual work to a single button click, virtually eliminating errors and improving costs</w:t>
       </w:r>
     </w:p>
     <w:p>
@@ -700,7 +634,7 @@
           <w:sz w:val="20"/>
           <w:szCs w:val="20"/>
         </w:rPr>
-        <w:t xml:space="preserve"> Python, JavaScript, SQL, GraphQL, SQLAlchemy, C#, C++, Java, Perl, PHP, HTML5, CSS3, XML, Shell, AWK, Visual Basic, VB.NET</w:t>
+        <w:t xml:space="preserve"> Python, JavaScript, SQL, GraphQL, C#, C++, Java, HTML5, CSS3, XML, Shell, AWK</w:t>
       </w:r>
     </w:p>
     <w:p>
@@ -724,7 +658,7 @@
           <w:sz w:val="20"/>
           <w:szCs w:val="20"/>
         </w:rPr>
-        <w:t xml:space="preserve"> Flask, Vue.js, React, Angular, Bootstrap, jQuery, Mustache, Jinja2, Cypress, Webapp2</w:t>
+        <w:t xml:space="preserve"> Flask, Vue.js, React, SQLAlchemy, Angular, Bootstrap, jQuery, Jinja2, Cypress</w:t>
         <w:br/>
       </w:r>
       <w:r>
@@ -760,7 +694,7 @@
           <w:sz w:val="20"/>
           <w:szCs w:val="20"/>
         </w:rPr>
-        <w:t xml:space="preserve"> PostgreSQL, Oracle, Microsoft SQL Server, MySQL, Informix, Cache, c-tree, Microsoft Access</w:t>
+        <w:t xml:space="preserve"> PostgreSQL, Oracle, Microsoft SQL Server, MySQL, Informix</w:t>
         <w:br/>
       </w:r>
       <w:r>
@@ -778,7 +712,7 @@
           <w:sz w:val="20"/>
           <w:szCs w:val="20"/>
         </w:rPr>
-        <w:t xml:space="preserve"> VS Code, DBVisualizer, Oracle Forms &amp; Reports, Crystal Reports, Jasper Reports, Visual Studio, Swagger, SpectaQL, Sphinx, Vuese</w:t>
+        <w:t xml:space="preserve"> VS Code, DBVisualizer, Visual Studio, Swagger, SpectaQL, Sphinx, Vuese</w:t>
         <w:br/>
       </w:r>
       <w:r>
@@ -796,7 +730,7 @@
           <w:sz w:val="20"/>
           <w:szCs w:val="20"/>
         </w:rPr>
-        <w:t xml:space="preserve"> Drupal, Joomla, WordPress</w:t>
+        <w:t xml:space="preserve"> Drupal</w:t>
         <w:br/>
       </w:r>
       <w:r>
@@ -1353,7 +1287,7 @@
           <w:rFonts w:cs="Arial" w:ascii="Arial" w:hAnsi="Arial"/>
           <w:color w:val="222222"/>
         </w:rPr>
-        <w:t xml:space="preserve">Repurposed NASA's Cumulus Dashboard into the </w:t>
+        <w:t xml:space="preserve">Repurposed NASA's Cumulus Dashboard as the </w:t>
       </w:r>
       <w:hyperlink r:id="rId6">
         <w:r>
@@ -1370,7 +1304,7 @@
           <w:rFonts w:cs="Arial" w:ascii="Arial" w:hAnsi="Arial"/>
           <w:color w:val="222222"/>
         </w:rPr>
-        <w:t xml:space="preserve"> powering my </w:t>
+        <w:t xml:space="preserve"> powering </w:t>
       </w:r>
       <w:hyperlink r:id="rId7">
         <w:r>
@@ -1404,7 +1338,7 @@
           <w:rFonts w:cs="Arial" w:ascii="Arial" w:hAnsi="Arial"/>
           <w:color w:val="222222"/>
         </w:rPr>
-        <w:t xml:space="preserve"> applications (Vue, React) serving all 12 NASA DAACs and all data producers</w:t>
+        <w:t xml:space="preserve"> applications (Vue, React) for all 12 NASA DAACs and all data producers</w:t>
       </w:r>
     </w:p>
     <w:p>
@@ -1507,7 +1441,7 @@
           <w:rFonts w:cs="Arial" w:ascii="Arial" w:hAnsi="Arial"/>
           <w:color w:val="222222"/>
         </w:rPr>
-        <w:t>Was 1 of 3 developers who delivered an Ingest Dashboard for ORNL DAAC ingest operations (MVP live), architected to interface with Earthdata Pub for QA and full automation</w:t>
+        <w:t>Delivered an Ingest Dashboard with a three-developer team for ORNL DAAC ingest operations (MVP live), architected to interface with Earthdata Pub for QA and full automation</w:t>
       </w:r>
     </w:p>
     <w:p>
@@ -1531,7 +1465,7 @@
           <w:rFonts w:cs="Arial" w:ascii="Arial" w:hAnsi="Arial"/>
           <w:color w:val="222222"/>
         </w:rPr>
-        <w:t>Designed automation scripts that reduced manual processing time by 80%</w:t>
+        <w:t>Automated processing workflows, reducing manual processing time by 80%</w:t>
       </w:r>
     </w:p>
     <w:p>
@@ -1555,7 +1489,7 @@
           <w:rFonts w:cs="Arial" w:ascii="Arial" w:hAnsi="Arial"/>
           <w:color w:val="222222"/>
         </w:rPr>
-        <w:t>Refactored sites and scripts from Perl to Python using an efficient templating system</w:t>
+        <w:t>Modernized sites and scripts from Perl to Python using an efficient templating system</w:t>
       </w:r>
     </w:p>
     <w:p>
@@ -1579,7 +1513,7 @@
           <w:rFonts w:cs="Arial" w:ascii="Arial" w:hAnsi="Arial"/>
           <w:color w:val="222222"/>
         </w:rPr>
-        <w:t>Implemented automated unit and end-to-end testing, improving deployment confidence and reducing regression defects</w:t>
+        <w:t>Implemented automated unit and end-to-end testing to improve deployment confidence and reduce regression defects</w:t>
       </w:r>
     </w:p>
     <w:p>
@@ -1603,7 +1537,7 @@
           <w:rFonts w:cs="Arial" w:ascii="Arial" w:hAnsi="Arial"/>
           <w:color w:val="222222"/>
         </w:rPr>
-        <w:t>Implemented metadata import/export pipelines supporting multiple formats and standards</w:t>
+        <w:t>Built metadata import/export pipelines supporting multiple formats and standards</w:t>
       </w:r>
     </w:p>
     <w:p>
@@ -1632,17 +1566,15 @@
     </w:p>
     <w:p>
       <w:pPr>
-        <w:pStyle w:val="ListParagraph"/>
+        <w:pStyle w:val="Normal"/>
         <w:rPr>
           <w:rFonts w:ascii="Arial" w:hAnsi="Arial" w:cs="Arial"/>
-          <w:color w:val="222222"/>
-        </w:rPr>
-      </w:pPr>
-      <w:r>
-        <w:rPr>
-          <w:rFonts w:cs="Arial" w:ascii="Arial" w:hAnsi="Arial"/>
-          <w:color w:val="222222"/>
-        </w:rPr>
+          <w:b/>
+          <w:b/>
+        </w:rPr>
+      </w:pPr>
+      <w:r>
+        <w:rPr/>
       </w:r>
     </w:p>
     <w:p>
@@ -1730,7 +1662,7 @@
           <w:rFonts w:cs="Arial" w:ascii="Arial" w:hAnsi="Arial"/>
           <w:color w:val="222222"/>
         </w:rPr>
-        <w:t>Designed and implemented administrative software system to replace the entire data processing department</w:t>
+        <w:t>Automated publishing workflows from hours of manual work to a single button click, virtually eliminating errors and improving costs</w:t>
       </w:r>
     </w:p>
     <w:p>
@@ -1754,7 +1686,7 @@
           <w:rFonts w:cs="Arial" w:ascii="Arial" w:hAnsi="Arial"/>
           <w:color w:val="222222"/>
         </w:rPr>
-        <w:t>Automated publishing workflows, reducing hours of manual work to a single button click while virtually eliminating errors and improving company costs</w:t>
+        <w:t>Standardized data across multiple formats through automated import/export pipelines</w:t>
       </w:r>
     </w:p>
     <w:p>
@@ -1778,7 +1710,7 @@
           <w:rFonts w:cs="Arial" w:ascii="Arial" w:hAnsi="Arial"/>
           <w:color w:val="222222"/>
         </w:rPr>
-        <w:t>Standardized data across multiple formats via automated import/export pipelines</w:t>
+        <w:t>Automated tasks via scripts across multiple environments and languages</w:t>
       </w:r>
     </w:p>
     <w:p>
@@ -1802,7 +1734,88 @@
           <w:rFonts w:cs="Arial" w:ascii="Arial" w:hAnsi="Arial"/>
           <w:color w:val="222222"/>
         </w:rPr>
-        <w:t>Automated tasks via scripts across multiple environments and languages</w:t>
+        <w:t>Maintained and enhanced custom, publication, and company web platforms with feature and framework improvements</w:t>
+      </w:r>
+    </w:p>
+    <w:p>
+      <w:pPr>
+        <w:pStyle w:val="Normal"/>
+        <w:rPr/>
+      </w:pPr>
+      <w:r>
+        <w:rPr/>
+      </w:r>
+    </w:p>
+    <w:p>
+      <w:pPr>
+        <w:pStyle w:val="Normal"/>
+        <w:rPr/>
+      </w:pPr>
+      <w:r>
+        <w:rPr>
+          <w:rFonts w:cs="Arial" w:ascii="Arial" w:hAnsi="Arial"/>
+          <w:b/>
+        </w:rPr>
+        <w:t xml:space="preserve">LIBERA, INC. </w:t>
+      </w:r>
+      <w:r>
+        <w:rPr>
+          <w:rFonts w:cs="Arial" w:ascii="Arial" w:hAnsi="Arial"/>
+        </w:rPr>
+        <w:t>– Knoxville, TN</w:t>
+        <w:tab/>
+        <w:tab/>
+        <w:tab/>
+        <w:tab/>
+        <w:tab/>
+        <w:tab/>
+        <w:tab/>
+        <w:tab/>
+        <w:tab/>
+        <w:t xml:space="preserve">         </w:t>
+        <w:tab/>
+      </w:r>
+      <w:r>
+        <w:rPr>
+          <w:rFonts w:cs="Arial" w:ascii="Arial" w:hAnsi="Arial"/>
+          <w:b/>
+        </w:rPr>
+        <w:t>10/15 – 07/16</w:t>
+      </w:r>
+    </w:p>
+    <w:p>
+      <w:pPr>
+        <w:pStyle w:val="Normal"/>
+        <w:rPr>
+          <w:rFonts w:ascii="Arial" w:hAnsi="Arial" w:cs="Arial"/>
+          <w:i/>
+          <w:i/>
+        </w:rPr>
+      </w:pPr>
+      <w:r>
+        <w:rPr>
+          <w:rFonts w:cs="Arial" w:ascii="Arial" w:hAnsi="Arial"/>
+          <w:i/>
+        </w:rPr>
+        <w:t>Web Application Developer</w:t>
+      </w:r>
+    </w:p>
+    <w:p>
+      <w:pPr>
+        <w:pStyle w:val="Normal"/>
+        <w:tabs>
+          <w:tab w:val="clear" w:pos="720"/>
+          <w:tab w:val="left" w:pos="2520" w:leader="none"/>
+        </w:tabs>
+        <w:rPr>
+          <w:rFonts w:ascii="Arial" w:hAnsi="Arial" w:cs="Arial"/>
+        </w:rPr>
+      </w:pPr>
+      <w:r>
+        <w:rPr>
+          <w:rFonts w:cs="Arial" w:ascii="Arial" w:hAnsi="Arial"/>
+        </w:rPr>
+        <w:t>Developed in: VB.NET / ASP.NET, XML, C#, TSQL, System7, SQL, Visual Studio 2015</w:t>
       </w:r>
     </w:p>
     <w:p>
@@ -1826,112 +1839,7 @@
           <w:rFonts w:cs="Arial" w:ascii="Arial" w:hAnsi="Arial"/>
           <w:color w:val="222222"/>
         </w:rPr>
-        <w:t>Maintained and enhanced custom, publication, and company web platforms with feature and framework improvements</w:t>
-      </w:r>
-    </w:p>
-    <w:p>
-      <w:pPr>
-        <w:pStyle w:val="Normal"/>
-        <w:rPr/>
-      </w:pPr>
-      <w:r>
-        <w:rPr/>
-      </w:r>
-    </w:p>
-    <w:p>
-      <w:pPr>
-        <w:pStyle w:val="Normal"/>
-        <w:rPr/>
-      </w:pPr>
-      <w:r>
-        <w:rPr>
-          <w:rFonts w:cs="Arial" w:ascii="Arial" w:hAnsi="Arial"/>
-          <w:b/>
-        </w:rPr>
-        <w:t xml:space="preserve">LIBERA, INC. </w:t>
-      </w:r>
-      <w:r>
-        <w:rPr>
-          <w:rFonts w:cs="Arial" w:ascii="Arial" w:hAnsi="Arial"/>
-        </w:rPr>
-        <w:t>– Knoxville, TN</w:t>
-        <w:tab/>
-        <w:tab/>
-        <w:tab/>
-        <w:tab/>
-        <w:tab/>
-        <w:tab/>
-        <w:tab/>
-        <w:tab/>
-        <w:tab/>
-        <w:t xml:space="preserve">         </w:t>
-        <w:tab/>
-      </w:r>
-      <w:r>
-        <w:rPr>
-          <w:rFonts w:cs="Arial" w:ascii="Arial" w:hAnsi="Arial"/>
-          <w:b/>
-        </w:rPr>
-        <w:t>10/15 – 07/16</w:t>
-      </w:r>
-    </w:p>
-    <w:p>
-      <w:pPr>
-        <w:pStyle w:val="Normal"/>
-        <w:rPr>
-          <w:rFonts w:ascii="Arial" w:hAnsi="Arial" w:cs="Arial"/>
-          <w:i/>
-          <w:i/>
-        </w:rPr>
-      </w:pPr>
-      <w:r>
-        <w:rPr>
-          <w:rFonts w:cs="Arial" w:ascii="Arial" w:hAnsi="Arial"/>
-          <w:i/>
-        </w:rPr>
-        <w:t>Web Application Programmer</w:t>
-      </w:r>
-    </w:p>
-    <w:p>
-      <w:pPr>
-        <w:pStyle w:val="Normal"/>
-        <w:tabs>
-          <w:tab w:val="clear" w:pos="720"/>
-          <w:tab w:val="left" w:pos="2520" w:leader="none"/>
-        </w:tabs>
-        <w:rPr>
-          <w:rFonts w:ascii="Arial" w:hAnsi="Arial" w:cs="Arial"/>
-        </w:rPr>
-      </w:pPr>
-      <w:r>
-        <w:rPr>
-          <w:rFonts w:cs="Arial" w:ascii="Arial" w:hAnsi="Arial"/>
-        </w:rPr>
-        <w:t>Developed in: VB.NET / ASP.NET, XML, C#, TSQL, System7, SQL, Visual Studio 2015</w:t>
-      </w:r>
-    </w:p>
-    <w:p>
-      <w:pPr>
-        <w:pStyle w:val="Normal"/>
-        <w:numPr>
-          <w:ilvl w:val="0"/>
-          <w:numId w:val="2"/>
-        </w:numPr>
-        <w:tabs>
-          <w:tab w:val="left" w:pos="720" w:leader="none"/>
-        </w:tabs>
-        <w:ind w:left="1080" w:right="0" w:hanging="360"/>
-        <w:rPr>
-          <w:rFonts w:ascii="Arial" w:hAnsi="Arial" w:cs="Arial"/>
-          <w:color w:val="222222"/>
-        </w:rPr>
-      </w:pPr>
-      <w:r>
-        <w:rPr>
-          <w:rFonts w:cs="Arial" w:ascii="Arial" w:hAnsi="Arial"/>
-          <w:color w:val="222222"/>
-        </w:rPr>
-        <w:t>Implemented Vocational Rehabilitation program updates affecting all agencies statewide</w:t>
+        <w:t>Implemented statewide Vocational Rehabilitation program updates affecting all agencies</w:t>
       </w:r>
     </w:p>
     <w:p>
@@ -5531,6 +5439,13 @@
       <w:iCs/>
     </w:rPr>
   </w:style>
+  <w:style w:type="character" w:styleId="SourceText">
+    <w:name w:val="Source Text"/>
+    <w:qFormat/>
+    <w:rPr>
+      <w:rFonts w:ascii="Liberation Mono" w:hAnsi="Liberation Mono" w:eastAsia="Noto Sans Mono CJK SC" w:cs="Liberation Mono"/>
+    </w:rPr>
+  </w:style>
   <w:style w:type="paragraph" w:styleId="Heading">
     <w:name w:val="Heading"/>
     <w:basedOn w:val="Normal"/>
@@ -5818,6 +5733,19 @@
     </w:pPr>
     <w:rPr/>
   </w:style>
+  <w:style w:type="paragraph" w:styleId="PreformattedText">
+    <w:name w:val="Preformatted Text"/>
+    <w:basedOn w:val="Normal"/>
+    <w:qFormat/>
+    <w:pPr>
+      <w:spacing w:before="0" w:after="0"/>
+    </w:pPr>
+    <w:rPr>
+      <w:rFonts w:ascii="Liberation Mono" w:hAnsi="Liberation Mono" w:eastAsia="Noto Sans Mono CJK SC" w:cs="Liberation Mono"/>
+      <w:sz w:val="20"/>
+      <w:szCs w:val="20"/>
+    </w:rPr>
+  </w:style>
   <w:style w:type="numbering" w:styleId="WW8Num1">
     <w:name w:val="WW8Num1"/>
     <w:qFormat/>

</xml_diff>

<commit_message>
Align resume achievements across formats
</commit_message>
<xml_diff>
--- a/kkb_08052026.docx
+++ b/kkb_08052026.docx
@@ -564,13 +564,13 @@
           <w:rFonts w:cs="Arial" w:ascii="Arial" w:hAnsi="Arial"/>
           <w:b/>
         </w:rPr>
-        <w:t>Contributed to ONC Stage 1 and Stage 2 Electronic Health Record Certification</w:t>
-      </w:r>
-      <w:r>
-        <w:rPr>
-          <w:rFonts w:cs="Arial" w:ascii="Arial" w:hAnsi="Arial"/>
-        </w:rPr>
-        <w:t>: Electronic Health Record Software Certification - 1 of 3 developers assigned</w:t>
+        <w:t>Contributed to ONC Stage 1 and Stage 2 Electronic Health Record certification as one of three assigned developers.</w:t>
+      </w:r>
+      <w:r>
+        <w:rPr>
+          <w:rFonts w:cs="Arial" w:ascii="Arial" w:hAnsi="Arial"/>
+        </w:rPr>
+        <w:t/>
       </w:r>
       <w:r>
         <w:rPr>
@@ -2205,6 +2205,25 @@
           <w:rFonts w:cs="Arial" w:ascii="Arial" w:hAnsi="Arial"/>
         </w:rPr>
         <w:t>Indirectly led other EHR programmers on client-facing clinical software projects</w:t>
+      </w:r>
+    </w:p>
+    <w:p>
+      <w:pPr>
+        <w:pStyle w:val="Normal"/>
+        <w:numPr>
+          <w:ilvl w:val="0"/>
+          <w:numId w:val="3"/>
+        </w:numPr>
+        <w:ind w:left="1080" w:right="0" w:hanging="360"/>
+        <w:rPr>
+          <w:rFonts w:ascii="Arial" w:hAnsi="Arial" w:cs="Arial"/>
+        </w:rPr>
+      </w:pPr>
+      <w:r>
+        <w:rPr>
+          <w:rFonts w:cs="Arial" w:ascii="Arial" w:hAnsi="Arial"/>
+        </w:rPr>
+        <w:t>Contributed to ONC Stage 1 and Stage 2 Electronic Health Record certification as one of three assigned developers.</w:t>
       </w:r>
     </w:p>
     <w:p>

</xml_diff>

<commit_message>
Add tailored resumes and accessibility improvements
</commit_message>
<xml_diff>
--- a/kkb_08052026.docx
+++ b/kkb_08052026.docx
@@ -749,6 +749,42 @@
           <w:szCs w:val="20"/>
         </w:rPr>
         <w:t xml:space="preserve"> Cline, DUO AI, GitHub Copilot</w:t>
+        <w:br/>
+      </w:r>
+      <w:r>
+        <w:rPr>
+          <w:rStyle w:val="StrongEmphasis"/>
+          <w:rFonts w:cs="Arial"/>
+          <w:sz w:val="20"/>
+          <w:szCs w:val="20"/>
+        </w:rPr>
+        <w:t>Accessibility:</w:t>
+      </w:r>
+      <w:r>
+        <w:rPr>
+          <w:rFonts w:cs="Arial"/>
+          <w:sz w:val="20"/>
+          <w:szCs w:val="20"/>
+        </w:rPr>
+        <w:t xml:space="preserve"> Accessibility-minded front-end development</w:t>
+        <w:br/>
+      </w:r>
+      <w:r>
+        <w:rPr>
+          <w:rStyle w:val="StrongEmphasis"/>
+          <w:rFonts w:cs="Arial"/>
+          <w:sz w:val="20"/>
+          <w:szCs w:val="20"/>
+        </w:rPr>
+        <w:t>JavaScript Assessment:</w:t>
+      </w:r>
+      <w:r>
+        <w:rPr>
+          <w:rFonts w:cs="Arial"/>
+          <w:sz w:val="20"/>
+          <w:szCs w:val="20"/>
+        </w:rPr>
+        <w:t xml:space="preserve"> LinkedIn Skill Assessment — Expert</w:t>
         <w:br/>
       </w:r>
       <w:r>

</xml_diff>

<commit_message>
Align resume materials and supporting documents
</commit_message>
<xml_diff>
--- a/kkb_08052026.docx
+++ b/kkb_08052026.docx
@@ -225,7 +225,7 @@
           <w:szCs w:val="20"/>
           <w:u w:val="none"/>
         </w:rPr>
-        <w:t>Sole architect and lead developer of NASA Earthdata Pub Overview and Forms applications used by all 12 NASA DAACs and all Data Producers. Official NASA "Inventor" of Earthdata Pub (NASA Case No. GSC-18, 612-1).</w:t>
+        <w:t>Sole architect and lead developer of NASA Earthdata Pub Overview and Forms applications used by all 12 NASA DAACs and all Data Producers. Official NASA “Inventor” of Earthdata Pub (NASA Case No. GSC-18, 612-1).</w:t>
         <w:br/>
       </w:r>
       <w:r>
@@ -1332,7 +1332,7 @@
             <w:rFonts w:cs="Arial" w:ascii="Arial" w:hAnsi="Arial"/>
             <w:color w:val="222222"/>
           </w:rPr>
-          <w:t>NASA’s Earthdata Pub Dashboard</w:t>
+          <w:t>NASA's Earthdata Pub Dashboard</w:t>
         </w:r>
       </w:hyperlink>
       <w:r>
@@ -1374,7 +1374,7 @@
           <w:rFonts w:cs="Arial" w:ascii="Arial" w:hAnsi="Arial"/>
           <w:color w:val="222222"/>
         </w:rPr>
-        <w:t xml:space="preserve"> applications (Vue, React) for all 12 NASA DAACs and all data producers</w:t>
+        <w:t xml:space="preserve"> applications (Vue, React) for all 12 NASA DAACs and all Data Producers</w:t>
       </w:r>
     </w:p>
     <w:p>

</xml_diff>